<commit_message>
docs: documentacion gerencial (md y docx) sobre operacion, triage, infraestructura y modelo multinstancia
</commit_message>
<xml_diff>
--- a/documentacion/1_Informe_Ejecutivo_Estrategico_Proyecto_RPA.docx
+++ b/documentacion/1_Informe_Ejecutivo_Estrategico_Proyecto_RPA.docx
@@ -40,7 +40,7 @@
           <w:color w:val="465A73"/>
           <w:sz w:val="26"/>
         </w:rPr>
-        <w:t>Evaluación de Rendimiento, Condiciones de Despliegue en Infraestructura Virtual Windows, Gestión de Seguridad de Datos Sensibles (PHI) y Justificación de Continuidad 24/7</w:t>
+        <w:t>Evaluación de Rendimiento, Condiciones de Despliegue en Infraestructura Virtual Windows, Gestión de Seguridad de Datos Sensibles (PHI) y Justificación de Continuidad Operacional 24/7</w:t>
       </w:r>
     </w:p>
     <w:tbl>
@@ -52,7 +52,7 @@
         <w:tblBorders>
           <w:top w:val="single" w:sz="4" w:space="0" w:color="E2E8F0"/>
           <w:left w:val="none"/>
-          <w:bottom w:val="single" w:sz="4" w:space="0" w:color="E2E8F0"/>
+          <w:bottom w:val="single" w:sz="6" w:space="0" w:color="E2E8F0"/>
           <w:right w:val="none"/>
           <w:insideH w:val="single" w:sz="4" w:space="0" w:color="E2E8F0"/>
           <w:insideV w:val="none"/>
@@ -66,7 +66,7 @@
         <w:tc>
           <w:tcPr>
             <w:tcW w:type="dxa" w:w="2880"/>
-            <w:shd w:fill="F8FAFC"/>
+            <w:shd w:val="clear" w:color="auto" w:fill="F8FAFC"/>
             <w:tcMar>
               <w:top w:w="80" w:type="dxa"/>
               <w:bottom w:w="80" w:type="dxa"/>
@@ -92,7 +92,7 @@
         <w:tc>
           <w:tcPr>
             <w:tcW w:type="dxa" w:w="6480"/>
-            <w:shd w:fill="FFFFFF"/>
+            <w:shd w:val="clear" w:color="auto" w:fill="FFFFFF"/>
             <w:tcMar>
               <w:top w:w="80" w:type="dxa"/>
               <w:bottom w:w="80" w:type="dxa"/>
@@ -119,7 +119,7 @@
         <w:tc>
           <w:tcPr>
             <w:tcW w:type="dxa" w:w="2880"/>
-            <w:shd w:fill="F8FAFC"/>
+            <w:shd w:val="clear" w:color="auto" w:fill="F8FAFC"/>
             <w:tcMar>
               <w:top w:w="80" w:type="dxa"/>
               <w:bottom w:w="80" w:type="dxa"/>
@@ -145,7 +145,7 @@
         <w:tc>
           <w:tcPr>
             <w:tcW w:type="dxa" w:w="6480"/>
-            <w:shd w:fill="FFFFFF"/>
+            <w:shd w:val="clear" w:color="auto" w:fill="FFFFFF"/>
             <w:tcMar>
               <w:top w:w="80" w:type="dxa"/>
               <w:bottom w:w="80" w:type="dxa"/>
@@ -172,7 +172,7 @@
         <w:tc>
           <w:tcPr>
             <w:tcW w:type="dxa" w:w="2880"/>
-            <w:shd w:fill="F8FAFC"/>
+            <w:shd w:val="clear" w:color="auto" w:fill="F8FAFC"/>
             <w:tcMar>
               <w:top w:w="80" w:type="dxa"/>
               <w:bottom w:w="80" w:type="dxa"/>
@@ -198,7 +198,7 @@
         <w:tc>
           <w:tcPr>
             <w:tcW w:type="dxa" w:w="6480"/>
-            <w:shd w:fill="FFFFFF"/>
+            <w:shd w:val="clear" w:color="auto" w:fill="FFFFFF"/>
             <w:tcMar>
               <w:top w:w="80" w:type="dxa"/>
               <w:bottom w:w="80" w:type="dxa"/>
@@ -225,7 +225,7 @@
         <w:tc>
           <w:tcPr>
             <w:tcW w:type="dxa" w:w="2880"/>
-            <w:shd w:fill="F8FAFC"/>
+            <w:shd w:val="clear" w:color="auto" w:fill="F8FAFC"/>
             <w:tcMar>
               <w:top w:w="80" w:type="dxa"/>
               <w:bottom w:w="80" w:type="dxa"/>
@@ -251,7 +251,7 @@
         <w:tc>
           <w:tcPr>
             <w:tcW w:type="dxa" w:w="6480"/>
-            <w:shd w:fill="FFFFFF"/>
+            <w:shd w:val="clear" w:color="auto" w:fill="FFFFFF"/>
             <w:tcMar>
               <w:top w:w="80" w:type="dxa"/>
               <w:bottom w:w="80" w:type="dxa"/>
@@ -278,7 +278,7 @@
         <w:tc>
           <w:tcPr>
             <w:tcW w:type="dxa" w:w="2880"/>
-            <w:shd w:fill="F8FAFC"/>
+            <w:shd w:val="clear" w:color="auto" w:fill="F8FAFC"/>
             <w:tcMar>
               <w:top w:w="80" w:type="dxa"/>
               <w:bottom w:w="80" w:type="dxa"/>
@@ -304,7 +304,7 @@
         <w:tc>
           <w:tcPr>
             <w:tcW w:type="dxa" w:w="6480"/>
-            <w:shd w:fill="FFFFFF"/>
+            <w:shd w:val="clear" w:color="auto" w:fill="FFFFFF"/>
             <w:tcMar>
               <w:top w:w="80" w:type="dxa"/>
               <w:bottom w:w="80" w:type="dxa"/>
@@ -358,7 +358,7 @@
           <w:color w:val="282D37"/>
           <w:sz w:val="20"/>
         </w:rPr>
-        <w:t>El presente documento expone la justificación técnica, operacional y económica del Sistema de Automatización Robótica de Procesos (RPA) desarrollado para la integración y triage inteligente de exámenes radiológicos entre los sistemas RIS (Radiology Information System) y PACS (Picture Archiving and Communication System).</w:t>
+        <w:t>El presente documento expone la justificación técnica, operacional y estratégica del Sistema de Automatización Robótica de Procesos (RPA) desarrollado para la integración y triage inteligente de exámenes radiológicos entre los sistemas RIS (Radiology Information System) y PACS (Picture Archiving and Communication System).</w:t>
       </w:r>
     </w:p>
     <w:p>
@@ -371,66 +371,34 @@
           <w:color w:val="282D37"/>
           <w:sz w:val="20"/>
         </w:rPr>
-        <w:t>En la operación teleradiológica actual, la gestión de la lista de trabajo, la apertura de estudios, la verificación de órdenes médicas y la correlación paciente-estudio representan un cuello de botella logístico intensivo en mano de obra. Un operador humano altamente capacitado es capaz de procesar a un ritmo pico de 30 a 40 casos por hora bajo condiciones de concentración extrema. Sin embargo, la jornada humana está sujeta a limitaciones físicas evidentes: fatiga cognitiva tras varias horas de pantalla, pausas operacionales, riesgo de errores en la digitación de identificadores de pacientes y, de manera crítica, una cobertura limitada a turnos de 8 horas con costos crecientes para sostener guardias nocturnas, festivos y fines de semana.</w:t>
+        <w:t>En la operación teleradiológica actual, la gestión de la lista de trabajo, la apertura de estudios, la verificación de órdenes médicas y la correlación paciente-estudio representan un cuello de botella logístico intensivo en tiempo de dedicación. Un operador humano altamente capacitado es capaz de procesar a un ritmo pico de 30 a 40 casos por hora bajo condiciones de concentración extrema. Sin embargo, la jornada humana está sujeta a limitaciones naturales: fatiga cognitiva tras varias horas continuas de pantalla, pausas operacionales, riesgo de errores en la digitación de identificadores de pacientes y, de manera crítica, una cobertura limitada a turnos habituales de 8 horas con la dificultad recurrente de sostener la misma intensidad en turnos nocturnos, fines de semana y días feriados.</w:t>
       </w:r>
     </w:p>
-    <w:tbl>
-      <w:tblPr>
-        <w:tblW w:type="auto" w:w="0"/>
-        <w:jc w:val="center"/>
-        <w:tblLayout w:type="fixed"/>
-        <w:tblLook w:firstColumn="1" w:firstRow="1" w:lastColumn="0" w:lastRow="0" w:noHBand="0" w:noVBand="1" w:val="04A0"/>
-      </w:tblPr>
-      <w:tblGrid>
-        <w:gridCol w:w="9648"/>
-      </w:tblGrid>
-      <w:tr>
-        <w:tc>
-          <w:tcPr>
-            <w:tcW w:type="dxa" w:w="9360"/>
-            <w:shd w:fill="F0F4F8"/>
-            <w:tcMar>
-              <w:top w:w="160" w:type="dxa"/>
-              <w:bottom w:w="160" w:type="dxa"/>
-              <w:left w:w="240" w:type="dxa"/>
-              <w:right w:w="200" w:type="dxa"/>
-            </w:tcMar>
-            <w:tcBorders>
-              <w:top w:val="none"/>
-              <w:left w:val="single" w:sz="28" w:space="0" w:color="1B365D"/>
-              <w:bottom w:val="none"/>
-              <w:right w:val="none"/>
-            </w:tcBorders>
-          </w:tcPr>
-          <w:p>
-            <w:pPr>
-              <w:spacing w:before="40" w:after="60" w:line="276" w:lineRule="auto"/>
-            </w:pPr>
-            <w:r>
-              <w:rPr>
-                <w:rFonts w:ascii="Calibri" w:hAnsi="Calibri"/>
-                <w:b/>
-                <w:color w:val="1B365D"/>
-                <w:sz w:val="20"/>
-              </w:rPr>
-              <w:t xml:space="preserve">📌 TESIS CENTRAL PARA GERENCIA: </w:t>
-            </w:r>
-            <w:r>
-              <w:rPr>
-                <w:rFonts w:ascii="Calibri" w:hAnsi="Calibri"/>
-                <w:color w:val="334155"/>
-                <w:sz w:val="19"/>
-              </w:rPr>
-              <w:t>La propuesta de valor del Bot RPA no radica en competir en velocidad puntual contra un operador humano en su hora pico, sino en proporcionar una COBERTURA ININTERRUMPIDA 24/7/365, con CERO error de digitación, trazabilidad absoluta en base de datos y, fundamentalmente, la DETECCIÓN INMEDIATA de patologías críticas con alerta médica instantánea, protegiendo la vida del paciente y absorbiendo la carga nocturna.</w:t>
-            </w:r>
-          </w:p>
-        </w:tc>
-      </w:tr>
-    </w:tbl>
     <w:p>
       <w:pPr>
-        <w:spacing w:before="0" w:after="80"/>
+        <w:spacing w:before="160" w:after="160"/>
+        <w:ind w:left="360" w:right="360"/>
+        <w:pBdr>
+          <w:left w:val="single" w:sz="24" w:space="12" w:color="1B365D"/>
+        </w:pBdr>
       </w:pPr>
+      <w:r>
+        <w:rPr>
+          <w:rFonts w:ascii="Calibri" w:hAnsi="Calibri"/>
+          <w:b/>
+          <w:color w:val="1B365D"/>
+          <w:sz w:val="20"/>
+        </w:rPr>
+        <w:t xml:space="preserve">📌 TESIS CENTRAL PARA GERENCIA: </w:t>
+      </w:r>
+      <w:r>
+        <w:rPr>
+          <w:rFonts w:ascii="Calibri" w:hAnsi="Calibri"/>
+          <w:color w:val="334155"/>
+          <w:sz w:val="19"/>
+        </w:rPr>
+        <w:t>La propuesta de valor del Bot RPA no radica en competir en velocidad puntual contra un operador humano en su hora pico, sino en proporcionar una COBERTURA ININTERRUMPIDA 24/7/365, con CERO error de digitación, trazabilidad absoluta en base de datos y, fundamentalmente, la DETECCIÓN INMEDIATA de patologías críticas con alerta médica instantánea, protegiendo la vida del paciente y absorbiendo la carga en horarios inhábiles.</w:t>
+      </w:r>
     </w:p>
     <w:p>
       <w:pPr>
@@ -442,7 +410,7 @@
           <w:color w:val="282D37"/>
           <w:sz w:val="20"/>
         </w:rPr>
-        <w:t>El bot procesa actualmente cada caso en un ciclo completo de 5 a 7 minutos (~8 a 10 casos/hora sostenidos), priorizando deliberadamente la seguridad del paciente y la verificación rigurosa mediante visión por computador e Inteligencia Artificial antes de realizar cualquier acción en los sistemas clínicos. Al operar de manera desatendida durante las 24 horas del día, el sistema aporta una producción neta diaria de ~190 a 240 estudios procesados, eliminando el represamiento de casos durante la noche y entregando a primera hora del turno diurno una bandeja de trabajo depurada y auditada.</w:t>
+        <w:t>El bot procesa actualmente cada caso en un ciclo completo de 5 a 7 minutos (~8 a 10 casos/hora sostenidos), priorizando deliberadamente la seguridad del paciente y la verificación rigurosa mediante visión por computador e Inteligencia Artificial antes de realizar cualquier acción en los sistemas clínicos. Al operar de manera desatendida durante las 24 horas del día, el sistema aporta una producción neta diaria de ~190 a 240 estudios procesados, eliminando el represamiento de casos durante la noche y entregando a primera hora del turno matutino una bandeja de trabajo depurada y auditada.</w:t>
       </w:r>
     </w:p>
     <w:p>
@@ -514,7 +482,7 @@
           <w:color w:val="282D37"/>
           <w:sz w:val="20"/>
         </w:rPr>
-        <w:t>El bot navega en el portal RIS mediante automatización web, consulta la lista de exámenes pendientes de cierre o informe, extrae la ficha del paciente, médico solicitante y descarga el informe o solicitud médica en formato PDF.</w:t>
+        <w:t>El bot navega en el portal RIS mediante automatización web optimizada, consulta la lista de exámenes pendientes de cierre o informe, extrae la ficha del paciente, médico solicitante y descarga el informe o solicitud médica en formato PDF.</w:t>
       </w:r>
     </w:p>
     <w:p>
@@ -536,7 +504,7 @@
           <w:color w:val="282D37"/>
           <w:sz w:val="20"/>
         </w:rPr>
-        <w:t>El texto diagnóstico se procesa mediante un motor de tres capas: (1) Búsqueda normalizada directa, (2) Algoritmos de coincidencia difusa (Fuzzy Matching con RapidFuzz) y (3) Inferencia semántica con Modelos de Lenguaje Médico (LLM). Si el examen contiene hallazgos de emergencia (aneurismas, hemorragias cerebrales, tromboembolismo pulmonar, disección aórtica), el bot lo clasifica como Patología Crítica y activa el protocolo de emergencia.</w:t>
+        <w:t>El texto diagnóstico se procesa mediante un motor de tres capas: (1) Búsqueda normalizada directa, (2) Algoritmos de coincidencia difusa (Fuzzy Matching con RapidFuzz) y (3) Inferencia semántica con Modelos de Lenguaje Médico (LLM). Si el examen contiene hallazgos de emergencia (aneurismas, hemorragias cerebrales, tromboembolismo pulmonar, disección aórtica), el bot lo clasifica como Patología Crítica y activa el protocolo de emergencia médica.</w:t>
       </w:r>
     </w:p>
     <w:p>
@@ -608,7 +576,7 @@
           <w:color w:val="282D37"/>
           <w:sz w:val="20"/>
         </w:rPr>
-        <w:t>Para responder con claridad a la interrogante sobre la eficiencia del bot frente a los 30-40 casos por hora de un operador humano entrenado, la siguiente matriz contrasta ambas modalidades en una perspectiva operacional completa (jornada de 24 horas y costo total de operación):</w:t>
+        <w:t>Para contrastar con objetividad la cadencia puntual frente a la cobertura global, la siguiente matriz analiza ambas modalidades en una perspectiva operacional continua (jornada de 24 horas):</w:t>
       </w:r>
     </w:p>
     <w:tbl>
@@ -620,7 +588,7 @@
         <w:tblBorders>
           <w:top w:val="single" w:sz="4" w:space="0" w:color="CBD5E1"/>
           <w:left w:val="none"/>
-          <w:bottom w:val="single" w:sz="4" w:space="0" w:color="CBD5E1"/>
+          <w:bottom w:val="single" w:sz="6" w:space="0" w:color="CBD5E1"/>
           <w:right w:val="none"/>
           <w:insideH w:val="single" w:sz="4" w:space="0" w:color="CBD5E1"/>
           <w:insideV w:val="none"/>
@@ -641,7 +609,7 @@
               <w:left w:w="120" w:type="dxa"/>
               <w:right w:w="120" w:type="dxa"/>
             </w:tcMar>
-            <w:shd w:fill="1B365D"/>
+            <w:shd w:val="clear" w:color="auto" w:fill="1B365D"/>
           </w:tcPr>
           <w:p>
             <w:pPr>
@@ -667,7 +635,7 @@
               <w:left w:w="120" w:type="dxa"/>
               <w:right w:w="120" w:type="dxa"/>
             </w:tcMar>
-            <w:shd w:fill="1B365D"/>
+            <w:shd w:val="clear" w:color="auto" w:fill="1B365D"/>
           </w:tcPr>
           <w:p>
             <w:pPr>
@@ -693,7 +661,7 @@
               <w:left w:w="120" w:type="dxa"/>
               <w:right w:w="120" w:type="dxa"/>
             </w:tcMar>
-            <w:shd w:fill="1B365D"/>
+            <w:shd w:val="clear" w:color="auto" w:fill="1B365D"/>
           </w:tcPr>
           <w:p>
             <w:pPr>
@@ -721,7 +689,7 @@
               <w:left w:w="120" w:type="dxa"/>
               <w:right w:w="120" w:type="dxa"/>
             </w:tcMar>
-            <w:shd w:fill="F8FAFC"/>
+            <w:shd w:val="clear" w:color="auto" w:fill="F8FAFC"/>
           </w:tcPr>
           <w:p>
             <w:pPr>
@@ -747,7 +715,7 @@
               <w:left w:w="120" w:type="dxa"/>
               <w:right w:w="120" w:type="dxa"/>
             </w:tcMar>
-            <w:shd w:fill="F8FAFC"/>
+            <w:shd w:val="clear" w:color="auto" w:fill="F8FAFC"/>
           </w:tcPr>
           <w:p>
             <w:pPr>
@@ -772,7 +740,7 @@
               <w:left w:w="120" w:type="dxa"/>
               <w:right w:w="120" w:type="dxa"/>
             </w:tcMar>
-            <w:shd w:fill="F8FAFC"/>
+            <w:shd w:val="clear" w:color="auto" w:fill="F8FAFC"/>
           </w:tcPr>
           <w:p>
             <w:pPr>
@@ -799,7 +767,7 @@
               <w:left w:w="120" w:type="dxa"/>
               <w:right w:w="120" w:type="dxa"/>
             </w:tcMar>
-            <w:shd w:fill="FFFFFF"/>
+            <w:shd w:val="clear" w:color="auto" w:fill="FFFFFF"/>
           </w:tcPr>
           <w:p>
             <w:pPr>
@@ -825,7 +793,7 @@
               <w:left w:w="120" w:type="dxa"/>
               <w:right w:w="120" w:type="dxa"/>
             </w:tcMar>
-            <w:shd w:fill="FFFFFF"/>
+            <w:shd w:val="clear" w:color="auto" w:fill="FFFFFF"/>
           </w:tcPr>
           <w:p>
             <w:pPr>
@@ -850,7 +818,7 @@
               <w:left w:w="120" w:type="dxa"/>
               <w:right w:w="120" w:type="dxa"/>
             </w:tcMar>
-            <w:shd w:fill="FFFFFF"/>
+            <w:shd w:val="clear" w:color="auto" w:fill="FFFFFF"/>
           </w:tcPr>
           <w:p>
             <w:pPr>
@@ -877,7 +845,7 @@
               <w:left w:w="120" w:type="dxa"/>
               <w:right w:w="120" w:type="dxa"/>
             </w:tcMar>
-            <w:shd w:fill="F8FAFC"/>
+            <w:shd w:val="clear" w:color="auto" w:fill="F8FAFC"/>
           </w:tcPr>
           <w:p>
             <w:pPr>
@@ -903,7 +871,7 @@
               <w:left w:w="120" w:type="dxa"/>
               <w:right w:w="120" w:type="dxa"/>
             </w:tcMar>
-            <w:shd w:fill="F8FAFC"/>
+            <w:shd w:val="clear" w:color="auto" w:fill="F8FAFC"/>
           </w:tcPr>
           <w:p>
             <w:pPr>
@@ -928,7 +896,7 @@
               <w:left w:w="120" w:type="dxa"/>
               <w:right w:w="120" w:type="dxa"/>
             </w:tcMar>
-            <w:shd w:fill="F8FAFC"/>
+            <w:shd w:val="clear" w:color="auto" w:fill="F8FAFC"/>
           </w:tcPr>
           <w:p>
             <w:pPr>
@@ -955,7 +923,7 @@
               <w:left w:w="120" w:type="dxa"/>
               <w:right w:w="120" w:type="dxa"/>
             </w:tcMar>
-            <w:shd w:fill="FFFFFF"/>
+            <w:shd w:val="clear" w:color="auto" w:fill="FFFFFF"/>
           </w:tcPr>
           <w:p>
             <w:pPr>
@@ -968,7 +936,7 @@
                 <w:color w:val="1B365D"/>
                 <w:sz w:val="18"/>
               </w:rPr>
-              <w:t>Disponibilidad Nocturna / Festivos</w:t>
+              <w:t>Cobertura Nocturna / Festivos</w:t>
             </w:r>
           </w:p>
         </w:tc>
@@ -981,7 +949,7 @@
               <w:left w:w="120" w:type="dxa"/>
               <w:right w:w="120" w:type="dxa"/>
             </w:tcMar>
-            <w:shd w:fill="FFFFFF"/>
+            <w:shd w:val="clear" w:color="auto" w:fill="FFFFFF"/>
           </w:tcPr>
           <w:p>
             <w:pPr>
@@ -993,7 +961,7 @@
                 <w:color w:val="282D37"/>
                 <w:sz w:val="18"/>
               </w:rPr>
-              <w:t>Alto sobrecosto en horas extras y guardias</w:t>
+              <w:t>Requiere rotación y turnos de guardia</w:t>
             </w:r>
           </w:p>
         </w:tc>
@@ -1006,7 +974,7 @@
               <w:left w:w="120" w:type="dxa"/>
               <w:right w:w="120" w:type="dxa"/>
             </w:tcMar>
-            <w:shd w:fill="FFFFFF"/>
+            <w:shd w:val="clear" w:color="auto" w:fill="FFFFFF"/>
           </w:tcPr>
           <w:p>
             <w:pPr>
@@ -1018,7 +986,7 @@
                 <w:color w:val="282D37"/>
                 <w:sz w:val="18"/>
               </w:rPr>
-              <w:t>Operación 100% activa a costo marginal cero</w:t>
+              <w:t>Operación 100% activa e ininterrumpida</w:t>
             </w:r>
           </w:p>
         </w:tc>
@@ -1033,7 +1001,7 @@
               <w:left w:w="120" w:type="dxa"/>
               <w:right w:w="120" w:type="dxa"/>
             </w:tcMar>
-            <w:shd w:fill="F8FAFC"/>
+            <w:shd w:val="clear" w:color="auto" w:fill="F8FAFC"/>
           </w:tcPr>
           <w:p>
             <w:pPr>
@@ -1059,7 +1027,7 @@
               <w:left w:w="120" w:type="dxa"/>
               <w:right w:w="120" w:type="dxa"/>
             </w:tcMar>
-            <w:shd w:fill="F8FAFC"/>
+            <w:shd w:val="clear" w:color="auto" w:fill="F8FAFC"/>
           </w:tcPr>
           <w:p>
             <w:pPr>
@@ -1084,7 +1052,7 @@
               <w:left w:w="120" w:type="dxa"/>
               <w:right w:w="120" w:type="dxa"/>
             </w:tcMar>
-            <w:shd w:fill="F8FAFC"/>
+            <w:shd w:val="clear" w:color="auto" w:fill="F8FAFC"/>
           </w:tcPr>
           <w:p>
             <w:pPr>
@@ -1111,7 +1079,7 @@
               <w:left w:w="120" w:type="dxa"/>
               <w:right w:w="120" w:type="dxa"/>
             </w:tcMar>
-            <w:shd w:fill="FFFFFF"/>
+            <w:shd w:val="clear" w:color="auto" w:fill="FFFFFF"/>
           </w:tcPr>
           <w:p>
             <w:pPr>
@@ -1137,7 +1105,7 @@
               <w:left w:w="120" w:type="dxa"/>
               <w:right w:w="120" w:type="dxa"/>
             </w:tcMar>
-            <w:shd w:fill="FFFFFF"/>
+            <w:shd w:val="clear" w:color="auto" w:fill="FFFFFF"/>
           </w:tcPr>
           <w:p>
             <w:pPr>
@@ -1162,7 +1130,7 @@
               <w:left w:w="120" w:type="dxa"/>
               <w:right w:w="120" w:type="dxa"/>
             </w:tcMar>
-            <w:shd w:fill="FFFFFF"/>
+            <w:shd w:val="clear" w:color="auto" w:fill="FFFFFF"/>
           </w:tcPr>
           <w:p>
             <w:pPr>
@@ -1189,7 +1157,7 @@
               <w:left w:w="120" w:type="dxa"/>
               <w:right w:w="120" w:type="dxa"/>
             </w:tcMar>
-            <w:shd w:fill="F8FAFC"/>
+            <w:shd w:val="clear" w:color="auto" w:fill="F8FAFC"/>
           </w:tcPr>
           <w:p>
             <w:pPr>
@@ -1215,7 +1183,7 @@
               <w:left w:w="120" w:type="dxa"/>
               <w:right w:w="120" w:type="dxa"/>
             </w:tcMar>
-            <w:shd w:fill="F8FAFC"/>
+            <w:shd w:val="clear" w:color="auto" w:fill="F8FAFC"/>
           </w:tcPr>
           <w:p>
             <w:pPr>
@@ -1240,7 +1208,7 @@
               <w:left w:w="120" w:type="dxa"/>
               <w:right w:w="120" w:type="dxa"/>
             </w:tcMar>
-            <w:shd w:fill="F8FAFC"/>
+            <w:shd w:val="clear" w:color="auto" w:fill="F8FAFC"/>
           </w:tcPr>
           <w:p>
             <w:pPr>
@@ -1258,63 +1226,31 @@
         </w:tc>
       </w:tr>
     </w:tbl>
-    <w:tbl>
-      <w:tblPr>
-        <w:tblW w:type="auto" w:w="0"/>
-        <w:jc w:val="center"/>
-        <w:tblLayout w:type="fixed"/>
-        <w:tblLook w:firstColumn="1" w:firstRow="1" w:lastColumn="0" w:lastRow="0" w:noHBand="0" w:noVBand="1" w:val="04A0"/>
-      </w:tblPr>
-      <w:tblGrid>
-        <w:gridCol w:w="9648"/>
-      </w:tblGrid>
-      <w:tr>
-        <w:tc>
-          <w:tcPr>
-            <w:tcW w:type="dxa" w:w="9360"/>
-            <w:shd w:fill="F0F4F8"/>
-            <w:tcMar>
-              <w:top w:w="160" w:type="dxa"/>
-              <w:bottom w:w="160" w:type="dxa"/>
-              <w:left w:w="240" w:type="dxa"/>
-              <w:right w:w="200" w:type="dxa"/>
-            </w:tcMar>
-            <w:tcBorders>
-              <w:top w:val="none"/>
-              <w:left w:val="single" w:sz="28" w:space="0" w:color="1B365D"/>
-              <w:bottom w:val="none"/>
-              <w:right w:val="none"/>
-            </w:tcBorders>
-          </w:tcPr>
-          <w:p>
-            <w:pPr>
-              <w:spacing w:before="40" w:after="60" w:line="276" w:lineRule="auto"/>
-            </w:pPr>
-            <w:r>
-              <w:rPr>
-                <w:rFonts w:ascii="Calibri" w:hAnsi="Calibri"/>
-                <w:b/>
-                <w:color w:val="1B365D"/>
-                <w:sz w:val="20"/>
-              </w:rPr>
-              <w:t xml:space="preserve">📌 ANÁLISIS COMPARATIVO: </w:t>
-            </w:r>
-            <w:r>
-              <w:rPr>
-                <w:rFonts w:ascii="Calibri" w:hAnsi="Calibri"/>
-                <w:color w:val="334155"/>
-                <w:sz w:val="19"/>
-              </w:rPr>
-              <w:t>Conclusión Operativa: Si bien en 1 hora el humano supera al bot, al cabo de 24 horas el volumen neto procesado es equivalente (~200 casos diarios), con la diferencia radical de que el bot absorbe la noche y el fin de semana sin coste laboral adicional y con una capa de alerta clínica instantánea que el humano no puede mantener de forma constante.</w:t>
-            </w:r>
-          </w:p>
-        </w:tc>
-      </w:tr>
-    </w:tbl>
     <w:p>
       <w:pPr>
-        <w:spacing w:before="0" w:after="80"/>
+        <w:spacing w:before="160" w:after="160"/>
+        <w:ind w:left="360" w:right="360"/>
+        <w:pBdr>
+          <w:left w:val="single" w:sz="24" w:space="12" w:color="1B365D"/>
+        </w:pBdr>
       </w:pPr>
+      <w:r>
+        <w:rPr>
+          <w:rFonts w:ascii="Calibri" w:hAnsi="Calibri"/>
+          <w:b/>
+          <w:color w:val="1B365D"/>
+          <w:sz w:val="20"/>
+        </w:rPr>
+        <w:t xml:space="preserve">📌 ANÁLISIS COMPARATIVO: </w:t>
+      </w:r>
+      <w:r>
+        <w:rPr>
+          <w:rFonts w:ascii="Calibri" w:hAnsi="Calibri"/>
+          <w:color w:val="334155"/>
+          <w:sz w:val="19"/>
+        </w:rPr>
+        <w:t>Conclusión Operativa: Si bien en 1 hora puntual el humano supera al bot, al cabo de 24 horas el volumen neto procesado es equivalente (~200 casos diarios), con la diferencia radical de que el bot absorbe la noche y el fin de semana de forma constante y con una capa de alerta clínica instantánea que el humano no puede mantener de forma ininterrumpida.</w:t>
+      </w:r>
     </w:p>
     <w:p>
       <w:pPr>
@@ -1341,7 +1277,7 @@
           <w:color w:val="282D37"/>
           <w:sz w:val="20"/>
         </w:rPr>
-        <w:t>El proyecto fue diseñado bajo una arquitectura modular y resiliente en Python 3.13, combinando bibliotecas de grado empresarial que aseguran compatibilidad con software clínico moderno y heredado:</w:t>
+        <w:t>El proyecto fue diseñado bajo una arquitectura modular y resiliente en Python, combinando bibliotecas especializadas que aseguran compatibilidad con software clínico moderno y heredado:</w:t>
       </w:r>
     </w:p>
     <w:p>
@@ -1407,7 +1343,7 @@
           <w:color w:val="282D37"/>
           <w:sz w:val="20"/>
         </w:rPr>
-        <w:t>Integración con modelos de lenguaje de última generación optimizados para medicina (vía API segura). Se implementó un algoritmo de ranking dinámico que selecciona en milisegundos el modelo más rápido y certero para auditar la anatomía y el diagnóstico.</w:t>
+        <w:t>Integración con modelos de lenguaje optimizados para medicina. Se implementó un evaluador autónomo que selecciona en milisegundos el modelo más rápido y certero para auditar la anatomía y el diagnóstico.</w:t>
       </w:r>
     </w:p>
     <w:p>
@@ -1429,7 +1365,7 @@
           <w:color w:val="282D37"/>
           <w:sz w:val="20"/>
         </w:rPr>
-        <w:t>Control directo sobre el árbol de accesibilidad de Windows (UI Automation) y control de mouse/teclado para interactuar con el cliente pesado de Carestream Vue PACS sin requerir modificaciones en la infraestructura del proveedor.</w:t>
+        <w:t>Control directo sobre el árbol de accesibilidad de Windows (UI Automation) y control de mouse/teclado para interactuar con el cliente de Carestream Vue PACS sin requerir modificaciones en la infraestructura del proveedor.</w:t>
       </w:r>
     </w:p>
     <w:p>
@@ -1451,7 +1387,7 @@
           <w:color w:val="282D37"/>
           <w:sz w:val="20"/>
         </w:rPr>
-        <w:t>Servicio en segundo plano que permite supervisión desatendida. Los supervisores pueden consultar el estado, pausar el bot o solicitar una transmisión de video en vivo del escritorio de la máquina virtual desde su móvil ante cualquier anomalía.</w:t>
+        <w:t>Servicio en segundo plano que permite supervisión desatendida. Los supervisores pueden consultar el estado, pausar el bot o solicitar una transmisión de video en vivo del escritorio de la máquina virtual ante cualquier anomalía.</w:t>
       </w:r>
     </w:p>
     <w:p>
@@ -1473,7 +1409,7 @@
           <w:color w:val="282D37"/>
           <w:sz w:val="20"/>
         </w:rPr>
-        <w:t>Base de datos de auditoría con tablas de control de cola (registro_acciones), métricas de latencia de modelos de IA (log_llm_ranking) y repositorio de sinónimos médicos para aprendizaje continuo.</w:t>
+        <w:t>Base de datos de auditoría con tablas de control de cola (registro_acciones), métricas de latencia y repositorio de sinónimos médicos para aprendizaje continuo.</w:t>
       </w:r>
     </w:p>
     <w:p>
@@ -1488,7 +1424,7 @@
           <w:color w:val="1B365D"/>
           <w:sz w:val="30"/>
         </w:rPr>
-        <w:t>5. Recursos Consumidos y Costos de Operación</w:t>
+        <w:t>5. Recursos Técnicos Consumidos y Demanda de Sistema</w:t>
       </w:r>
     </w:p>
     <w:p>
@@ -1501,7 +1437,7 @@
           <w:color w:val="282D37"/>
           <w:sz w:val="20"/>
         </w:rPr>
-        <w:t>La solución destaca por su bajo impacto sobre los recursos corporativos y un costo marginal de operación prácticamente nulo:</w:t>
+        <w:t>La solución destaca por su bajo impacto sobre la infraestructura tecnológica corporativa:</w:t>
       </w:r>
     </w:p>
     <w:p>
@@ -1545,7 +1481,7 @@
           <w:color w:val="282D37"/>
           <w:sz w:val="20"/>
         </w:rPr>
-        <w:t>La huella de memoria del proceso base oscila entre 250 MB y 450 MB. Cuando se cargan los módulos de visión por computador y PySide/PyQt6 en memoria, el consumo total del sistema no supera los 1.5 GB de RAM.</w:t>
+        <w:t>La huella de memoria del proceso base oscila entre 250 MB y 450 MB. Cuando se cargan los módulos de visión por computador e interfaz en memoria, el consumo total del sistema no supera los 1.5 GB de RAM.</w:t>
       </w:r>
     </w:p>
     <w:p>
@@ -1567,7 +1503,7 @@
           <w:color w:val="282D37"/>
           <w:sz w:val="20"/>
         </w:rPr>
-        <w:t>El código base y sus entornos virtuales ocupan ~3.5 GB. La política de almacenamiento incluye purga programada de capturas de pantalla de depuración y compresión de archivos de bitácora, requiriendo menos de 10 GB de disco para operación anual.</w:t>
+        <w:t>El código base y sus entornos virtuales ocupan ~3.5 GB. La política de almacenamiento incluye depuración programada de capturas de depuración y compresión de bitácoras, requiriendo menos de 10 GB de disco para operación anual.</w:t>
       </w:r>
     </w:p>
     <w:p>
@@ -1589,29 +1525,7 @@
           <w:color w:val="282D37"/>
           <w:sz w:val="20"/>
         </w:rPr>
-        <w:t>Tráfico ligero consistente en llamadas REST para inferencia de diagnóstico (cargas útiles de texto de &lt;2 KB), tráfico web estándar contra el RIS y streaming de video solo bajo demanda expresa de supervisión humana.</w:t>
-      </w:r>
-    </w:p>
-    <w:p>
-      <w:pPr>
-        <w:spacing w:before="40" w:after="100" w:line="276" w:lineRule="auto"/>
-      </w:pPr>
-      <w:r>
-        <w:rPr>
-          <w:rFonts w:ascii="Calibri" w:hAnsi="Calibri"/>
-          <w:b/>
-          <w:color w:val="282D37"/>
-          <w:sz w:val="20"/>
-        </w:rPr>
-        <w:t xml:space="preserve">• Costo Financiero de Inteligencia Artificial: </w:t>
-      </w:r>
-      <w:r>
-        <w:rPr>
-          <w:rFonts w:ascii="Calibri" w:hAnsi="Calibri"/>
-          <w:color w:val="282D37"/>
-          <w:sz w:val="20"/>
-        </w:rPr>
-        <w:t>Las consultas de discernimiento clínico emplean modelos altamente optimizados. El costo por consulta ronda entre $0.0001 y $0.0005 USD. Para un volumen mensual de 6.000 estudios analizados, el gasto acumulado en IA es inferior a $3 USD mensuales.</w:t>
+        <w:t>Tráfico ligero consistente en llamadas REST para inferencia diagnóstica (cargas útiles de texto de &lt;2 KB), tráfico web estándar contra el RIS y streaming de video solo bajo demanda expresa de supervisión humana.</w:t>
       </w:r>
     </w:p>
     <w:p>
@@ -1667,7 +1581,7 @@
           <w:color w:val="282D37"/>
           <w:sz w:val="20"/>
         </w:rPr>
-        <w:t>Un temor habitual en la adopción de IA es el traspaso involuntario de datos personales a proveedores externos. En este sistema, el algoritmo implementa una política estricta de DESIDENTIFICACIÓN PREVIA: Únicamente se transmite al modelo de lenguaje el fragmento textual del diagnóstico médico (por ejemplo: 'se observa aneurisma fusiforme de aorta infrarrenal de 4.8 cm'). NUNCA se envía el nombre del paciente, RUT/cédula de identidad, fecha de nacimiento, número de ficha clínica ni procedencia institucional. La privacidad del paciente está resguardada por diseño.</w:t>
+        <w:t>Un temor habitual en la adopción de IA es el traspaso involuntario de datos personales a servicios externos. En este sistema, el algoritmo implementa una política estricta de DESIDENTIFICACIÓN PREVIA: Únicamente se transmite al modelo de lenguaje el fragmento textual del diagnóstico médico (por ejemplo: 'se observa aneurisma fusiforme de aorta infrarrenal de 4.8 cm'). NUNCA se envía el nombre del paciente, RUT/cédula de identidad, fecha de nacimiento, número de ficha clínica ni procedencia institucional. La privacidad del paciente está resguardada por diseño.</w:t>
       </w:r>
     </w:p>
     <w:p>
@@ -1763,7 +1677,7 @@
         <w:tblBorders>
           <w:top w:val="single" w:sz="4" w:space="0" w:color="CBD5E1"/>
           <w:left w:val="none"/>
-          <w:bottom w:val="single" w:sz="4" w:space="0" w:color="CBD5E1"/>
+          <w:bottom w:val="single" w:sz="6" w:space="0" w:color="CBD5E1"/>
           <w:right w:val="none"/>
           <w:insideH w:val="single" w:sz="4" w:space="0" w:color="CBD5E1"/>
           <w:insideV w:val="none"/>
@@ -1785,7 +1699,7 @@
               <w:left w:w="100" w:type="dxa"/>
               <w:right w:w="100" w:type="dxa"/>
             </w:tcMar>
-            <w:shd w:fill="1B365D"/>
+            <w:shd w:val="clear" w:color="auto" w:fill="1B365D"/>
           </w:tcPr>
           <w:p>
             <w:pPr>
@@ -1811,7 +1725,7 @@
               <w:left w:w="100" w:type="dxa"/>
               <w:right w:w="100" w:type="dxa"/>
             </w:tcMar>
-            <w:shd w:fill="1B365D"/>
+            <w:shd w:val="clear" w:color="auto" w:fill="1B365D"/>
           </w:tcPr>
           <w:p>
             <w:pPr>
@@ -1837,7 +1751,7 @@
               <w:left w:w="100" w:type="dxa"/>
               <w:right w:w="100" w:type="dxa"/>
             </w:tcMar>
-            <w:shd w:fill="1B365D"/>
+            <w:shd w:val="clear" w:color="auto" w:fill="1B365D"/>
           </w:tcPr>
           <w:p>
             <w:pPr>
@@ -1863,7 +1777,7 @@
               <w:left w:w="100" w:type="dxa"/>
               <w:right w:w="100" w:type="dxa"/>
             </w:tcMar>
-            <w:shd w:fill="1B365D"/>
+            <w:shd w:val="clear" w:color="auto" w:fill="1B365D"/>
           </w:tcPr>
           <w:p>
             <w:pPr>
@@ -1891,7 +1805,7 @@
               <w:left w:w="100" w:type="dxa"/>
               <w:right w:w="100" w:type="dxa"/>
             </w:tcMar>
-            <w:shd w:fill="F8FAFC"/>
+            <w:shd w:val="clear" w:color="auto" w:fill="F8FAFC"/>
           </w:tcPr>
           <w:p>
             <w:pPr>
@@ -1917,7 +1831,7 @@
               <w:left w:w="100" w:type="dxa"/>
               <w:right w:w="100" w:type="dxa"/>
             </w:tcMar>
-            <w:shd w:fill="F8FAFC"/>
+            <w:shd w:val="clear" w:color="auto" w:fill="F8FAFC"/>
           </w:tcPr>
           <w:p>
             <w:pPr>
@@ -1948,7 +1862,7 @@
               <w:left w:w="100" w:type="dxa"/>
               <w:right w:w="100" w:type="dxa"/>
             </w:tcMar>
-            <w:shd w:fill="F8FAFC"/>
+            <w:shd w:val="clear" w:color="auto" w:fill="F8FAFC"/>
           </w:tcPr>
           <w:p>
             <w:pPr>
@@ -1977,7 +1891,7 @@
               <w:left w:w="100" w:type="dxa"/>
               <w:right w:w="100" w:type="dxa"/>
             </w:tcMar>
-            <w:shd w:fill="F8FAFC"/>
+            <w:shd w:val="clear" w:color="auto" w:fill="F8FAFC"/>
           </w:tcPr>
           <w:p>
             <w:pPr>
@@ -2004,7 +1918,7 @@
               <w:left w:w="100" w:type="dxa"/>
               <w:right w:w="100" w:type="dxa"/>
             </w:tcMar>
-            <w:shd w:fill="FFFFFF"/>
+            <w:shd w:val="clear" w:color="auto" w:fill="FFFFFF"/>
           </w:tcPr>
           <w:p>
             <w:pPr>
@@ -2030,7 +1944,7 @@
               <w:left w:w="100" w:type="dxa"/>
               <w:right w:w="100" w:type="dxa"/>
             </w:tcMar>
-            <w:shd w:fill="FFFFFF"/>
+            <w:shd w:val="clear" w:color="auto" w:fill="FFFFFF"/>
           </w:tcPr>
           <w:p>
             <w:pPr>
@@ -2057,7 +1971,7 @@
               <w:left w:w="100" w:type="dxa"/>
               <w:right w:w="100" w:type="dxa"/>
             </w:tcMar>
-            <w:shd w:fill="FFFFFF"/>
+            <w:shd w:val="clear" w:color="auto" w:fill="FFFFFF"/>
           </w:tcPr>
           <w:p>
             <w:pPr>
@@ -2086,7 +2000,7 @@
               <w:left w:w="100" w:type="dxa"/>
               <w:right w:w="100" w:type="dxa"/>
             </w:tcMar>
-            <w:shd w:fill="FFFFFF"/>
+            <w:shd w:val="clear" w:color="auto" w:fill="FFFFFF"/>
           </w:tcPr>
           <w:p>
             <w:pPr>
@@ -2113,7 +2027,7 @@
               <w:left w:w="100" w:type="dxa"/>
               <w:right w:w="100" w:type="dxa"/>
             </w:tcMar>
-            <w:shd w:fill="F8FAFC"/>
+            <w:shd w:val="clear" w:color="auto" w:fill="F8FAFC"/>
           </w:tcPr>
           <w:p>
             <w:pPr>
@@ -2139,7 +2053,7 @@
               <w:left w:w="100" w:type="dxa"/>
               <w:right w:w="100" w:type="dxa"/>
             </w:tcMar>
-            <w:shd w:fill="F8FAFC"/>
+            <w:shd w:val="clear" w:color="auto" w:fill="F8FAFC"/>
           </w:tcPr>
           <w:p>
             <w:pPr>
@@ -2170,7 +2084,7 @@
               <w:left w:w="100" w:type="dxa"/>
               <w:right w:w="100" w:type="dxa"/>
             </w:tcMar>
-            <w:shd w:fill="F8FAFC"/>
+            <w:shd w:val="clear" w:color="auto" w:fill="F8FAFC"/>
           </w:tcPr>
           <w:p>
             <w:pPr>
@@ -2195,7 +2109,7 @@
               <w:left w:w="100" w:type="dxa"/>
               <w:right w:w="100" w:type="dxa"/>
             </w:tcMar>
-            <w:shd w:fill="F8FAFC"/>
+            <w:shd w:val="clear" w:color="auto" w:fill="F8FAFC"/>
           </w:tcPr>
           <w:p>
             <w:pPr>
@@ -2222,7 +2136,7 @@
               <w:left w:w="100" w:type="dxa"/>
               <w:right w:w="100" w:type="dxa"/>
             </w:tcMar>
-            <w:shd w:fill="FFFFFF"/>
+            <w:shd w:val="clear" w:color="auto" w:fill="FFFFFF"/>
           </w:tcPr>
           <w:p>
             <w:pPr>
@@ -2248,7 +2162,7 @@
               <w:left w:w="100" w:type="dxa"/>
               <w:right w:w="100" w:type="dxa"/>
             </w:tcMar>
-            <w:shd w:fill="FFFFFF"/>
+            <w:shd w:val="clear" w:color="auto" w:fill="FFFFFF"/>
           </w:tcPr>
           <w:p>
             <w:pPr>
@@ -2277,7 +2191,7 @@
               <w:left w:w="100" w:type="dxa"/>
               <w:right w:w="100" w:type="dxa"/>
             </w:tcMar>
-            <w:shd w:fill="FFFFFF"/>
+            <w:shd w:val="clear" w:color="auto" w:fill="FFFFFF"/>
           </w:tcPr>
           <w:p>
             <w:pPr>
@@ -2302,7 +2216,7 @@
               <w:left w:w="100" w:type="dxa"/>
               <w:right w:w="100" w:type="dxa"/>
             </w:tcMar>
-            <w:shd w:fill="FFFFFF"/>
+            <w:shd w:val="clear" w:color="auto" w:fill="FFFFFF"/>
           </w:tcPr>
           <w:p>
             <w:pPr>
@@ -2314,7 +2228,7 @@
                 <w:color w:val="282D37"/>
                 <w:sz w:val="17"/>
               </w:rPr>
-              <w:t>Equipo de escritorio local; requiere migración a infraestructura formal corporativa.</w:t>
+              <w:t>Equipo de escritorio local; sirve de base probada para dimensionar la VM final.</w:t>
             </w:r>
           </w:p>
         </w:tc>
@@ -2345,7 +2259,7 @@
           <w:color w:val="282D37"/>
           <w:sz w:val="20"/>
         </w:rPr>
-        <w:t>Para que la máquina virtual ejecute el bot de forma desatendida y sin fallas, el equipo de Infraestructura y TI debe garantizar cuatro directrices operacionales estrictas:</w:t>
+        <w:t>Para que la máquina virtual ejecute el bot de forma desatendida y sin fallas, se deben garantizar cuatro directrices operacionales estrictas:</w:t>
       </w:r>
     </w:p>
     <w:p>
@@ -2483,7 +2397,7 @@
           <w:color w:val="282D37"/>
           <w:sz w:val="20"/>
         </w:rPr>
-        <w:t>En condiciones normales, un informe con hallazgo grave (ej. disección aórtica o hemorragia subaracnoidea) puede permanecer horas en cola esperando que un operador lo abra en su turno. El bot analiza el texto clínico en segundos y dispara alertas inmediatas al radiólogo de turno, transformando la teleradiología reactiva en un servicio de triage activo que salva vidas.</w:t>
+        <w:t>En condiciones normales, un informe con hallazgo grave (ej. disección aórtica o hemorragia subaracnoidea) puede permanecer horas en cola esperando que un operador lo abra en su turno. El bot analiza el texto clínico en segundos y dispara alertas inmediatas al radiólogo de turno, transformando la teleradiología reactiva en un servicio de triage activo que salvaguarda la salud del paciente.</w:t>
       </w:r>
     </w:p>
     <w:p>
@@ -2497,7 +2411,7 @@
           <w:color w:val="282D37"/>
           <w:sz w:val="20"/>
         </w:rPr>
-        <w:t xml:space="preserve">2. Continuidad Operacional 24/7 sin Sobrecostos Laborales: </w:t>
+        <w:t xml:space="preserve">2. Continuidad Operacional 24/7 y Absorción de Demanda: </w:t>
       </w:r>
       <w:r>
         <w:rPr>
@@ -2505,7 +2419,7 @@
           <w:color w:val="282D37"/>
           <w:sz w:val="20"/>
         </w:rPr>
-        <w:t>Al mantener la operación durante las noches, fines de semana y días festivos, el bot absorbe de forma continua cientos de estudios, evitando la acumulación masiva que suele colapsar a los equipos humanos a las 8:00 AM de cada jornada.</w:t>
+        <w:t>Al mantener la operación durante las noches, fines de semana y días festivos, el bot absorbe de forma continua cientos de estudios, evitando la acumulación masiva que suele colapsar a los equipos humanos a las 8:00 AM de cada jornada laboral.</w:t>
       </w:r>
     </w:p>
     <w:p>

</xml_diff>